<commit_message>
docs: update presentation doc with show page redesign, image upload, filters and new UI components
</commit_message>
<xml_diff>
--- a/docs/Presentazione_My_Projects.docx
+++ b/docs/Presentazione_My_Projects.docx
@@ -715,6 +715,16 @@
       </w:r>
     </w:p>
     <w:p>
+      <w:r>
+        <w:t>La index page include un filtro a tendina per categoria con pulsante di reset, selettore del numero di righe per pagina (10/25/50), e badge categoria cliccabili che diventano non cliccabili quando il filtro è attivo.</w:t>
+      </w:r>
+    </w:p>
+    <w:p>
+      <w:r>
+        <w:t>Ogni progetto supporta un'immagine di anteprima con upload tramite drag &amp; drop o selezione file, descrizione alt-text, e lightbox a schermo intero. La show page presenta una layout a due colonne con barra metadata (ID, timestamps con tooltip), breadcrumb navigazionale, badge categoria e tecnologie compatti, e textarea descrizione ridimensionabile. In assenza di immagine, viene mostrato un placeholder con bordo tratteggiato.</w:t>
+      </w:r>
+    </w:p>
+    <w:p>
       <w:pPr>
         <w:pStyle w:val="Heading2"/>
       </w:pPr>
@@ -1059,7 +1069,7 @@
     </w:p>
     <w:p>
       <w:r>
-        <w:t>SetLocale: middleware applicato al gruppo web che legge la lingua dalla sessione (impostata via GET /language/{locale}) e la applica a tutta l'applicazione. Le traduzioni sono gestite tramite file JSON (lang/it.json con 127 chiavi).</w:t>
+        <w:t>SetLocale: middleware applicato al gruppo web che legge la lingua dalla sessione (impostata via GET /language/{locale}) e la applica a tutta l'applicazione. Le traduzioni sono gestite tramite file JSON (lang/it.json con 140 chiavi).</w:t>
       </w:r>
     </w:p>
     <w:p>
@@ -1755,6 +1765,51 @@
       </w:pPr>
       <w:r>
         <w:t>Palette Preview: esploratore interattivo di 10 palette, 9 mix, 12 colori primari, 3 stili card</w:t>
+      </w:r>
+    </w:p>
+    <w:p>
+      <w:r>
+        <w:t>Upload area drag &amp; drop con bordo tratteggiato, anteprima e rimozione immagine</w:t>
+      </w:r>
+    </w:p>
+    <w:p>
+      <w:r>
+        <w:t>Placeholder immagine con bordo dashed e icona per progetti senza immagine</w:t>
+      </w:r>
+    </w:p>
+    <w:p>
+      <w:r>
+        <w:t>Lightbox modale Bootstrap per ingrandimento immagine con overlay trasparente</w:t>
+      </w:r>
+    </w:p>
+    <w:p>
+      <w:r>
+        <w:t>Textarea descrizione readonly con ridimensionamento verticale, altezza minima 6 righe e scroll automatico</w:t>
+      </w:r>
+    </w:p>
+    <w:p>
+      <w:r>
+        <w:t>Badge categoria cliccabili che filtrano la index (non cliccabili se filtro attivo)</w:t>
+      </w:r>
+    </w:p>
+    <w:p>
+      <w:r>
+        <w:t>Dropdown filtro categorie con sync del colore dell'opzione selezionata e pulsante di reset rosso</w:t>
+      </w:r>
+    </w:p>
+    <w:p>
+      <w:r>
+        <w:t>Breadcrumb navigazionale (Progetti &gt; Categoria &gt; Titolo) con bottone Indietro affiancato</w:t>
+      </w:r>
+    </w:p>
+    <w:p>
+      <w:r>
+        <w:t>Tooltip Bootstrap su icone metadata (ID, data creazione, aggiornamento, categoria, tecnologie)</w:t>
+      </w:r>
+    </w:p>
+    <w:p>
+      <w:r>
+        <w:t>Barra metadata compatta sotto il titolo: ID (ambra), data creazione (blu), ultimo aggiornamento (verde)</w:t>
       </w:r>
     </w:p>
     <w:p>

</xml_diff>